<commit_message>
feat: deploy NeuroBot v5 with finger flexion replays, 62 tests, and 4-tier 24/7 Render keep-alive
</commit_message>
<xml_diff>
--- a/paper/NeuroBot_IEEE_Report_v10.docx
+++ b/paper/NeuroBot_IEEE_Report_v10.docx
@@ -738,7 +738,7 @@
           <w:sz w:val="18"/>
           <w:szCs w:val="18"/>
         </w:rPr>
-        <w:t xml:space="preserve">—This report describes NeuroBot, a self-trained EEG brain-computer interface pipeline: its motivation, methods, development history, deployment and results. Motivated by the real-time finger-level robotic hand control of Ding </w:t>
+        <w:t xml:space="preserve">—This report describes NeuroBot, an EEG brain-computer interface that we trained ourselves. We were motivated by the real-time finger-level robotic hand control of Ding </w:t>
       </w:r>
       <w:r>
         <w:rPr>
@@ -760,7 +760,7 @@
           <w:sz w:val="18"/>
           <w:szCs w:val="18"/>
         </w:rPr>
-        <w:t xml:space="preserve"> [1], we first built two limb-level decoders (left fist, right fist or rest; both fists, both feet or rest) on the PhysioNet Motor Movement/Imagery Database [2], [3], using EEGNet [4] and the convolutional transformer TCFormer [5] (through Braindecode [6]) with a per-subject pretrain and fine-tune protocol. Over eleven iterations we found and fixed two leaks in our evaluation split, one from subject order and one from overlapping windows. On ten subjects with a trial-level split, TCFormer with cross-subject pretraining and three-seed averaging reaches group-mean majority-vote accuracies of 74.4% and 70.0% for Task A and 86.7% and 71.1% for Task B (executed and imagined movement; chance 33.3%). Compared with the same model trained without pretraining, the gain is significant only for Task B executed movement (+7.8 points, p = 0.003). A single-subject pilot on the finger dataset [7] reaches 79.9% for two fingers and 44.6% for three fingers on executed movement. The system is deployed as a software-only three-tier web service with no external API.</w:t>
+        <w:t xml:space="preserve"> [1], so we started with two limb-level decoders (left fist, right fist or rest; both fists, both feet or rest) on the PhysioNet Motor Movement/Imagery Database [2], [3]. We used EEGNet [4] and the convolutional transformer TCFormer [5] (through Braindecode [6]), each trained with a per-subject pretrain and fine-tune protocol. Over eleven iterations we found and fixed two leaks in our evaluation split, one from subject order and one from overlapping windows. On ten subjects with a trial-level split, TCFormer with cross-subject pretraining and three-seed averaging reaches group-mean majority-vote accuracies of 74.4% and 70.0% for Task A and 86.7% and 71.1% for Task B (executed and imagined movement; chance 33.3%). Against the same model trained without pretraining, the gain is significant only for Task B executed movement (+7.8 points, p = 0.003). A single-subject pilot on the finger dataset [7] reaches 79.9% for two fingers and 44.6% for three fingers on executed movement. The system is deployed as a software-only three-tier web service with no external API.</w:t>
       </w:r>
     </w:p>
     <w:p>
@@ -820,7 +820,7 @@
           <w:sz w:val="20"/>
           <w:szCs w:val="20"/>
         </w:rPr>
-        <w:t xml:space="preserve">Brain-computer interfaces (BCIs) translate neural activity directly into control signals, offering a communication and control pathway for individuals with motor impairment as well as novel human-computer interaction paradigms for the general population [8]. Invasive BCIs, which record from within or on the surface of the brain, offer high spatial precision but require surgery; noninvasive BCIs based on scalp EEG are accessible to a far wider population but have historically been limited to coarse control—whole-limb movement, binary choices, or slow spelling interfaces—because individual, closely spaced sources of neural activity are difficult to separate from scalp recordings. Executed and imagined movement modulate sensorimotor rhythms over the motor cortex (event-related desynchronization and synchronization) [9], [10], and it is this signal that motor-imagery BCIs learn to decode [11].</w:t>
+        <w:t xml:space="preserve">Brain-computer interfaces (BCIs) turn neural activity into control signals. They can give people with motor impairment a way to communicate and control devices, and they offer new ways for anyone to interact with computers [8]. Invasive BCIs record from inside or on the surface of the brain. They have high spatial precision but need surgery. Noninvasive BCIs based on scalp EEG reach many more people, but they have mostly been limited to coarse control such as whole-limb movement, binary choices or slow spelling, because it is hard to separate closely spaced neural sources from scalp recordings. Executed and imagined movement change sensorimotor rhythms over the motor cortex (event-related desynchronization and synchronization) [9], [10], and motor-imagery BCIs learn to decode this signal [11].</w:t>
       </w:r>
     </w:p>
     <w:p>
@@ -835,7 +835,7 @@
           <w:sz w:val="20"/>
           <w:szCs w:val="20"/>
         </w:rPr>
-        <w:t xml:space="preserve">NeuroBot started as our attempt to rebuild such a decoding pipeline ourselves, from first principles and with models we trained, using no external API and no pretrained third-party service. We first checked the approach on limb-level motor tasks and only then turned to the finger-level task of the base paper. Fig. 1 shows the pipeline from raw EEG to the output served to the user.</w:t>
+        <w:t xml:space="preserve">NeuroBot began as our attempt to rebuild such a decoding pipeline ourselves, with models we trained and no external API or pretrained third-party service. We first tested the approach on limb-level motor tasks and only then moved to the finger-level task of the base paper. Fig. 1 shows the pipeline from raw EEG to the output the user sees.</w:t>
       </w:r>
     </w:p>
     <w:p>
@@ -911,7 +911,7 @@
           <w:sz w:val="20"/>
           <w:szCs w:val="20"/>
         </w:rPr>
-        <w:t xml:space="preserve">The remainder of this report is organized as follows: Section 2 reviews related work; Section 3 states the problem and scope; Section 4 describes the datasets; Section 5 details the proposed methodology; Section 6 narrates the iterative development history; Section 7 summarizes results; Section 8 describes the software system and its deployment; Section 9 discusses limitations; Section 10 outlines future work; and Section 11 concludes.</w:t>
+        <w:t xml:space="preserve">The rest of this report is organized as follows. Section 2 reviews related work, Section 3 states the problem and scope, Section 4 describes the datasets, and Section 5 explains the methodology. Section 6 tells the development history, Section 7 summarizes results, and Section 8 describes the software and its deployment. Sections 9, 10 and 11 cover limitations, future work and the conclusion.</w:t>
       </w:r>
     </w:p>
     <w:p>
@@ -943,7 +943,7 @@
           <w:sz w:val="20"/>
           <w:szCs w:val="20"/>
         </w:rPr>
-        <w:t xml:space="preserve">Ding, Udompanyawit, Zhang, and He [1] recorded 128-channel EEG (BioSemi ActiveTwo, 1024 Hz, international 10-20 placement) from 21 right-handed, experienced BCI users performing cued individual-finger movements—both physically executed (ME) and motor-imagined (MI)—across one offline and multiple online sessions per subject. A deep convolutional network (EEGNet [4]) was trained per subject with an online fine-tuning mechanism, decoding 1-second windows into finger-class predictions that drove a robotic hand in real time. In the offline sessions the four fingers of the right hand (thumb, index, middle and pinky) were each flexed and extended repeatedly, or imagined being so. The online tasks used thumb versus pinky (two fingers) and thumb, index and pinky (three fingers). The study reports online accuracies of 81.10% (executed) and 80.56% (imagined) for two fingers and 60.11% and 60.61% for three fingers, and identifies that fingers activating more distinct cortical regions (e.g., thumb versus pinky) are more separable than adjacent fingers.</w:t>
+        <w:t xml:space="preserve">Ding, Udompanyawit, Zhang, and He [1] recorded 128-channel EEG (BioSemi ActiveTwo, 1024 Hz, international 10-20 placement) from 21 right-handed subjects who were experienced BCI users. The subjects made cued finger movements, either physically executed (ME) or imagined (MI), over one offline session and several online sessions each. A deep convolutional network (EEGNet [4]) was trained for each subject and fine-tuned online. It decoded 1-second windows into finger classes that moved a robotic hand in real time. In the offline sessions the four fingers of the right hand (thumb, index, middle and pinky) were each flexed and extended repeatedly, or imagined being so. The online tasks used thumb versus pinky (two fingers) and thumb, index and pinky (three fingers). The study reports online accuracies of 81.10% (executed) and 80.56% (imagined) for two fingers and 60.11% and 60.61% for three fingers. It also finds that fingers which activate more distinct cortical regions, such as thumb and pinky, are easier to tell apart than neighboring fingers.</w:t>
       </w:r>
     </w:p>
     <w:p>
@@ -958,7 +958,7 @@
           <w:sz w:val="20"/>
           <w:szCs w:val="20"/>
         </w:rPr>
-        <w:t xml:space="preserve">The authors released both the dataset and their training code publicly, which this project consulted directly rather than inferring the methodology secondhand. The dataset (KiltHub/Figshare, DOI 10.1184/R1/29104040 [7]) totals approximately 502.77 GB across 21 subjects, structured as per-subject FieldTrip-style MATLAB files with associated event markers. The official code release (github.com/bfinl/Finger-BCI-Decoding) confirms the exact preprocessing used: 1-second analysis windows, downsampling from 1024 Hz to 100 Hz, a 4–40 Hz band-pass filter, and EEGNet hyperparameters of F1=8, D=2, F2=16, and a temporal kernel length of 32—values this project adopted for its own EEGNet configuration (Section 5.2). The official code validates only two- and three-class configurations; no four-finger configuration is present in the authors’ released pipeline.</w:t>
+        <w:t xml:space="preserve">The authors released both the dataset and their training code, and we read both directly instead of guessing the methodology. The dataset (KiltHub/Figshare, DOI 10.1184/R1/29104040 [7]) is about 502.77 GB for 21 subjects, stored as per-subject FieldTrip-style MATLAB files with event markers. The code release (github.com/bfinl/FingerBCI-Decoding) shows the preprocessing they used: 1-second windows, downsampling from 1024 Hz to 100 Hz, a 4–40 Hz band-pass filter, and EEGNet hyperparameters F1=8, D=2, F2=16 and a temporal kernel length of 32. We adopted these values for our own EEGNet (Section 5.2). The code covers only two- and three-class setups. It has no four-finger configuration.</w:t>
       </w:r>
     </w:p>
     <w:p>
@@ -1043,7 +1043,7 @@
           <w:sz w:val="20"/>
           <w:szCs w:val="20"/>
         </w:rPr>
-        <w:t xml:space="preserve"> The Transformer [15] models long-range dependencies through self-attention. EEG Conformer [16] places a self-attention module after a temporal-spatial convolution module so that global correlations among local temporal features can be captured. TCFormer [5] combines a multi-kernel convolutional front end, a Transformer encoder using grouped-query attention [17] and rotary position embeddings [18], and a temporal convolutional network (TCN) classification head [19].</w:t>
+        <w:t xml:space="preserve"> The Transformer [15] models long-range dependencies with self-attention. EEG Conformer [16] puts a self-attention module after a temporal-spatial convolution module, so it can capture global relations among local temporal features. TCFormer [5] combines a multi-kernel convolutional front end, a Transformer encoder with grouped-query attention [17] and rotary position embeddings [18], and a temporal convolutional network (TCN) classification head [19].</w:t>
       </w:r>
     </w:p>
     <w:p>
@@ -1129,7 +1129,7 @@
           <w:sz w:val="20"/>
           <w:szCs w:val="20"/>
         </w:rPr>
-        <w:t xml:space="preserve"> Transformer-style training commonly pairs the Adam optimizer [21] with decoupled weight decay (AdamW) [22], a warm-up followed by cosine learning-rate decay [23], and label smoothing [24]. The implementation here uses PyTorch [25] and MNE-Python [26] for EEG handling, with the TCFormer implementation taken from Braindecode [6]. Relative to this literature, NeuroBot contributes (i) a per-subject hybrid pretrain/fine-tune protocol, a form of transfer learning [27], applied to a CNN and a CNN-Transformer, (ii) a documented diagnosis and correction of a self-attention token bottleneck when TCFormer is applied to short windows, and (iii) a software-only, API-free deployment of the trained models.</w:t>
+        <w:t xml:space="preserve"> Transformer-style training commonly uses the Adam optimizer [21] with decoupled weight decay (AdamW) [22], a warm-up followed by cosine learning-rate decay [23], and label smoothing [24]. We use PyTorch [25] and MNE-Python [26] for EEG handling, and take TCFormer from Braindecode [6]. Compared with this literature, NeuroBot contributes three things: (i) a per-subject hybrid pretrain/fine-tune protocol, a form of transfer learning [27], applied to a CNN and a CNN-Transformer; (ii) a documented diagnosis and fix of a self-attention token bottleneck when TCFormer is applied to short windows; and (iii) a software-only deployment of the trained models with no external API.</w:t>
       </w:r>
     </w:p>
     <w:p>
@@ -1178,7 +1178,7 @@
           <w:sz w:val="20"/>
           <w:szCs w:val="20"/>
         </w:rPr>
-        <w:t xml:space="preserve">The goal is a self-trained pipeline that decodes movement intention from EEG, both for coarse limb-level tasks and for the finger-level task of the base paper, without an external API, a cloud inference service or a pretrained third-party model. If useful accuracy can be reached from raw EEG to a working software output, that is a small but reproducible step toward more accessible noninvasive assistive BCIs.</w:t>
+        <w:t xml:space="preserve">The goal is a pipeline that we train ourselves and that decodes movement intention from EEG. It should work for coarse limb-level tasks and for the finger-level task of the base paper, without an external API, a cloud inference service or a pretrained third-party model. If we can get useful accuracy from raw EEG all the way to a working software output, that is a small but reproducible step toward more accessible noninvasive assistive BCIs.</w:t>
       </w:r>
     </w:p>
     <w:p>
@@ -4927,7 +4927,7 @@
           <w:sz w:val="20"/>
           <w:szCs w:val="20"/>
         </w:rPr>
-        <w:t xml:space="preserve">The project’s methodology evolved through eleven iterations, several of which involved identifying and correcting genuine methodological errors rather than simple hyperparameter adjustment. This history is reported in full for transparency and reproducibility. Fig. 2 shows the three-tier software architecture that the models are deployed in, and Table II lists every iteration with its result.</w:t>
+        <w:t xml:space="preserve">The method changed over eleven iterations. Several of them were fixes for real methodological errors, not hyperparameter tuning. We report the whole history so that others can reproduce it and see what went wrong. Fig. 2 shows the three-tier software architecture the models are deployed in, and Table II lists every iteration with its result.</w:t>
       </w:r>
     </w:p>
     <w:p>
@@ -6340,7 +6340,7 @@
           <w:sz w:val="20"/>
           <w:szCs w:val="20"/>
         </w:rPr>
-        <w:t xml:space="preserve">We learned five things along the way. First, the v2 result of about 57% on both tasks looked too similar to be real, and that led us to the subject-order leak. After the fix, Task B (both fists or feet) again scored higher than Task A, as expected physiologically. Second, separating ME and MI completely (v4) lost more through data starvation than it gained through specialization, so we moved to the hybrid protocol. Third, the hybrid protocol exposed a second bug: the data were loaded as one block of ME followed by one block of MI, so a single chronological split left one mode without training data. We now split within each mode. Fourth, averaging in a specialist of the other mode (v6) made results worse, so the ME and MI models stay separate. Fifth, an audit showed that overlapping windows of the same trial ended up on both sides of the fine-tune/evaluation split. Splitting by whole trial lowered the executed-movement group means from 75.2% and 80.7% to 65.6% and 70.0% (Section 7). Leakage of this kind is common in deep-learning EEG studies [28], so accuracy should be checked for it before it is reported.</w:t>
+        <w:t xml:space="preserve">Five lessons came out of this history. First, the v2 result of about 57% on both tasks looked too similar across tasks to be believable, and checking it led us to the subject-order leak. After the fix, Task B (both fists or feet) again scored higher than Task A, as we would expect from the physiology. Second, separating ME and MI completely (v4) cost more through lack of data than it gained from specialization, so we moved to the hybrid protocol. Third, the hybrid protocol exposed a second bug. The data were loaded as one block of ME followed by one block of MI, so a single chronological split left one mode with no training data. We now split within each mode. Fourth, averaging in a specialist for the other mode (v6) made results worse, so the ME and MI models stay separate. Fifth, an audit showed that overlapping windows of the same trial ended up on both sides of the fine-tune/evaluation split. Splitting by whole trial lowered the executed-movement group means from 75.2% and 80.7% to 65.6% and 70.0% (Section 7). Leakage like this is common in deep-learning EEG studies [28], so it should be checked for before any accuracy is reported.</w:t>
       </w:r>
     </w:p>
     <w:p>
@@ -6372,7 +6372,7 @@
           <w:sz w:val="20"/>
           <w:szCs w:val="20"/>
         </w:rPr>
-        <w:t xml:space="preserve">Table III reports the final trial-level evaluation of TCFormer on ten subjects: group-mean majority-vote accuracy with spread across subjects, using about 18 held-out trials per subject and mode. Task A is left-fist/right-fist/rest and Task B is both-fists/both-feet/rest. Fig. 3 plots the means against chance and the 85% target.</w:t>
+        <w:t xml:space="preserve">Table III gives the trial-level evaluation of TCFormer on ten subjects: the group-mean majority-vote accuracy and its spread across subjects, with about 18 held-out trials per subject and mode. Task A is left fist, right fist or rest, and Task B is both fists, both feet or rest. Fig. 3 plots the means against chance and the 85% target.</w:t>
       </w:r>
     </w:p>
     <w:p>
@@ -7529,7 +7529,7 @@
           <w:sz w:val="20"/>
           <w:szCs w:val="20"/>
         </w:rPr>
-        <w:t xml:space="preserve">All four single-run group means (Table III) are well above the 33.3% chance level but below the 85% target. Subject variability dominates: Task B executed-movement accuracy ranges from 22.2% to 100%, and in each condition only one or two subjects reach 85%. Two subjects (S006 and S009) score below chance on Task B executed movement; with only 18 trials this is within sampling noise for a subject whose signal the model cannot use. Imagined movement is lower than executed movement in both tasks (by 5.6 and 10.6 points).</w:t>
+        <w:t xml:space="preserve">All four single-run group means (Table III) are well above the 33.3% chance level and below the 85% target. Differences between subjects matter most. Task B executed-movement accuracy ranges from 22.2% to 100%, and in each condition only one or two subjects reach 85%. Two subjects (S006 and S009) score below chance on Task B executed movement. With only 18 trials this is within sampling noise for a subject whose signal the model cannot use. Imagined movement is lower than executed movement in both tasks (by 5.6 and 10.6 points).</w:t>
       </w:r>
     </w:p>
     <w:p>
@@ -8285,7 +8285,7 @@
           <w:sz w:val="20"/>
           <w:szCs w:val="20"/>
         </w:rPr>
-        <w:t xml:space="preserve">Table IV compares the earlier window-level split with the final trial-level split. The drop of 5–16 points is the expected effect of removing near-duplicate windows from the evaluation data. It is not a pure measurement of leakage, because the protocols also differ in split proportions (70/15/15 versus 60/20/20) and evaluation-set size, and each figure comes from a single run.</w:t>
+        <w:t xml:space="preserve">Table IV compares the earlier window-level split with the final trial-level split. The drop of 5–16 points is what we would expect from removing near-duplicate windows from the evaluation data. It does not measure leakage cleanly, because the two protocols also differ in split proportions (70/15/15 versus 60/20/20) and in evaluation-set size, and each figure comes from a single run.</w:t>
       </w:r>
     </w:p>
     <w:p>
@@ -8310,7 +8310,7 @@
           <w:sz w:val="20"/>
           <w:szCs w:val="20"/>
         </w:rPr>
-        <w:t xml:space="preserve"> The architecture comparison rests on two earlier head-to-head runs that used the window-level split (Table V; Section 6, v7–v8) and one run per task under the trial-level split with cross-subject pretraining (Tables VI and VII). TCFormer scored higher in all eight comparisons, by 3.7 to 17.4 points (mean 12.1), although EEGNet itself varied by up to 8.1 points between the two runs. Because both runs used the window-level split, this shows the relative ordering of the architectures under that protocol; it is not an estimate of the gap under the trial-level split. In the trial-level runs with cross-subject pretraining the gap is smaller and depends on task and mode: 8.3 points on imagined movement but none on executed movement for Task A, and 7.8 points on executed movement (significant) against 6.1 on imagined movement (not significant) for Task B (Tables VI and VII).</w:t>
+        <w:t xml:space="preserve"> The comparison rests on two earlier head-to-head runs with the window-level split (Table V; Section 6, v7–v8) and one run per task under the trial-level split with cross-subject pretraining (Tables VI and VII). TCFormer scored higher in all eight comparisons, by 3.7 to 17.4 points (mean 12.1), although EEGNet itself varied by up to 8.1 points between the two runs. Both runs used the window-level split, so this shows which architecture ranks higher under that protocol. It does not estimate the gap under the trial-level split. In the trial-level runs with cross-subject pretraining the gap is smaller and depends on task and mode. For Task A it is 8.3 points on imagined movement and none on executed movement. For Task B it is 7.8 points on executed movement (significant) and 6.1 on imagined movement (not significant) (Tables VI and VII).</w:t>
       </w:r>
     </w:p>
     <w:p>
@@ -9249,7 +9249,7 @@
           <w:sz w:val="20"/>
           <w:szCs w:val="20"/>
         </w:rPr>
-        <w:t xml:space="preserve"> Training is not seeded for model initialization and batch order, while the data split is fixed. Two independent runs of the same trial-level code gave Task A means of 58.9% (ME) and 57.2% (MI) in the first run and 65.6% and 60.0% in the second, and a Task B executed-movement mean of 76.1% against 70.0%—differences of up to 6.7 points in group mean. For Task A executed movement the per-subject difference between runs has a standard deviation of 12.4 points (maximum 22.2) although the two runs correlate (</w:t>
+        <w:t xml:space="preserve"> We did not seed the model initialization or batch order, while the data split is fixed. Two independent runs of the same trial-level code gave Task A means of 58.9% (ME) and 57.2% (MI) in the first run and 65.6% and 60.0% in the second, and a Task B executed-movement mean of 76.1% against 70.0%. The group means differ by up to 6.7 points. For Task A executed movement the per-subject difference between the two runs has a standard deviation of 12.4 points (maximum 22.2), although the runs are correlated (</w:t>
       </w:r>
       <w:r>
         <w:rPr>
@@ -9292,7 +9292,7 @@
           <w:sz w:val="20"/>
           <w:szCs w:val="20"/>
         </w:rPr>
-        <w:t xml:space="preserve"> A pilot on Task A, subjects S001–S004, with two seeds and the same held-out trials, compared the trial-level recipe with a variant that first pretrains TCFormer on 20 other subjects (never an evaluated subject) before the per-subject stages. With the softmax outputs of the two seeds averaged, executed- and imagined-movement accuracy was 69.4% and 68.1% for the baseline and 75.0% and 75.0% with cross-subject pretraining, a paired gain of +5.6 and +6.9 points; three of the four subjects improved in each mode, and seed-to-seed variability was mixed. With four subjects and about 18 trials each, the paired standard errors are roughly 6 and 5 points, so this is suggestive rather than conclusive; the ten-subject Task A run below extends it.</w:t>
+        <w:t xml:space="preserve"> We ran a pilot on Task A with subjects S001–S004, two seeds and the same held-out trials. It compared the trial-level recipe with a variant that first pretrains TCFormer on 20 other subjects (never an evaluated subject) before the per-subject stages. With the softmax outputs of the two seeds averaged, executed- and imagined-movement accuracy was 69.4% and 68.1% for the baseline and 75.0% and 75.0% with cross-subject pretraining, a paired gain of +5.6 and +6.9 points. Three of the four subjects improved in each mode, and the seed-to-seed variability was mixed. With four subjects and about 18 trials each, the paired standard errors are roughly 6 and 5 points, so the result is suggestive, not conclusive. The ten-subject Task A run below extends it.</w:t>
       </w:r>
     </w:p>
     <w:p>
@@ -9317,7 +9317,7 @@
           <w:sz w:val="20"/>
           <w:szCs w:val="20"/>
         </w:rPr>
-        <w:t xml:space="preserve"> The pilot was extended to all ten subjects of Task A (Table VI). TCFormer and EEGNet were each pretrained once on 30 other subjects (S011–S040, every second window, never an evaluated subject) and then trained per subject with three seeds whose softmax outputs were averaged, on the same trial-level split (18 held-out trials per subject). TCFormer reached 74.4% (ME) and 70.0% (MI), EEGNet 75.0% and 61.7%, and the equal-weight average of the two 75.6% and 69.4%. Relative to the single-run baseline of Table III this is +8.8 and +10.0 points for TCFormer, but two single runs of the same code already differ by up to 6.7 points, so the effect of pretraining is measured against a same-protocol baseline in Table VIII (+8.3 points in both modes, not significant). Seed averaging is not the explanation: it moved group means by only 0.8–1.7 points (mean single-seed accuracy: TCFormer 75.2% and 69.1%, EEGNet 73.3% and 63.3%). On the pilot’s four subjects this run gave 68.1% (ME) and 81.9% (MI) against 75.0% and 75.0% in the pilot (30 versus 20 pretraining subjects, three versus two seeds), another reminder of the run-to-run spread. TCFormer exceeded EEGNet by 8.3 points on MI (paired t-test p = 0.048, Wilcoxon p = 0.078; better for 6, equal for 3 and worse for 1 of 10 subjects) and matched it on ME (−0.6 points, p = 0.88). The ensemble did not improve on TCFormer alone (+1.1 and −0.6 points). Three subjects (S005, S006, S009) are not above chance on MI by an exact binomial test (at least 10 of 18 trials are needed), whereas all ten are above chance on ME; per-subject ME and MI accuracies are uncorrelated in this task (r = 0.02, n = 10, so only a rough indication). Task B follows in Table VII.</w:t>
+        <w:t xml:space="preserve"> We extended the pilot to all ten subjects of Task A (Table VI). TCFormer and EEGNet were each pretrained once on 30 other subjects (S011–S040, every second window, never an evaluated subject). Each was then trained per subject with three seeds, whose softmax outputs were averaged, on the same trial-level split (18 held-out trials per subject). TCFormer reached 74.4% (ME) and 70.0% (MI), EEGNet 75.0% and 61.7%, and the equal-weight average of the two 75.6% and 69.4%. Against the single-run baseline of Table III this is +8.8 and +10.0 points for TCFormer. But two single runs of the same code already differ by up to 6.7 points, so we measure the effect of pretraining against a same-protocol baseline in Table VIII (+8.3 points in both modes, not significant). Seed averaging does not explain the gain: it moved group means by only 0.8–1.7 points (mean single-seed accuracy: TCFormer 75.2% and 69.1%, EEGNet 73.3% and 63.3%). On the pilot’s four subjects this run gave 68.1% (ME) and 81.9% (MI), against 75.0% and 75.0% in the pilot (30 versus 20 pretraining subjects, three versus two seeds). That is another reminder of the run-to-run spread. TCFormer beat EEGNet by 8.3 points on MI (paired t-test p = 0.048, Wilcoxon p = 0.078; better for 6, equal for 3 and worse for 1 of 10 subjects) and matched it on ME (−0.6 points, p = 0.88). The ensemble did not improve on TCFormer alone (+1.1 and −0.6 points). Three subjects (S005, S006, S009) are not above chance on MI by an exact binomial test (at least 10 of 18 trials are needed), while all ten are above chance on ME. Per-subject ME and MI accuracies are uncorrelated in this task (r = 0.02, n = 10, so only a rough indication). Task B follows in Table VII.</w:t>
       </w:r>
     </w:p>
     <w:p>
@@ -10826,7 +10826,7 @@
           <w:sz w:val="20"/>
           <w:szCs w:val="20"/>
         </w:rPr>
-        <w:t xml:space="preserve"> The same recipe was run on Task B (Table VII). TCFormer reached 86.7% (ME) and 71.1% (MI), EEGNet 78.9% and 65.0%, and the equal-weight average of the two 88.9% and 70.0%. Relative to the single-run baselines of Table III (70.0% and 59.4%) this looks like +16.7 and +11.7 points for TCFormer, but the same-protocol baseline of Table VIII (78.9% and 71.1%) shows that the apparent gain was largely run-to-run variation: +7.8 points on ME and none on MI. The 95% confidence interval of the TCFormer executed-movement mean is ±9.4 points across the ten subjects, so a true mean below the 85% target is not excluded. All ten subjects are above chance on ME and eight of ten on MI. Seed averaging again changed group means by at most 0.6 points (mean single-seed accuracy: TCFormer 86.5% and 70.9%, EEGNet 78.3% and 65.0%). TCFormer exceeded EEGNet by 7.8 points on ME (paired t-test p = 0.010, Wilcoxon p = 0.016; better for 7 and equal for 3 of 10 subjects) and by 6.1 points on MI (p = 0.21, not significant). The ensemble was not reliably better than TCFormer alone (+2.2 points on ME, p = 0.27; −1.1 on MI). Per-subject ME and MI accuracies are moderately correlated in this task (r = 0.55, n = 10). Subjects S006 and S009 were at or below chance on MI in both tasks, although S009 reached 94.4% and 88.9% on ME, which points to an imagery-specific weakness rather than a generally poor responder.</w:t>
+        <w:t xml:space="preserve"> We ran the same recipe on Task B (Table VII). TCFormer reached 86.7% (ME) and 71.1% (MI), EEGNet 78.9% and 65.0%, and the equal-weight average of the two 88.9% and 70.0%. Against the single-run baselines of Table III (70.0% and 59.4%) this looks like +16.7 and +11.7 points for TCFormer. The same-protocol baseline of Table VIII (78.9% and 71.1%) shows that most of that apparent gain was run-to-run variation: the real gain is +7.8 points on ME and none on MI. The 95% confidence interval of the TCFormer executed-movement mean is ±9.4 points across the ten subjects, so a true mean below the 85% target is not ruled out. All ten subjects are above chance on ME and eight of ten on MI. Seed averaging again changed group means by at most 0.6 points (mean single-seed accuracy: TCFormer 86.5% and 70.9%, EEGNet 78.3% and 65.0%). TCFormer beat EEGNet by 7.8 points on ME (paired t-test p = 0.010, Wilcoxon p = 0.016; better for 7 and equal for 3 of 10 subjects) and by 6.1 points on MI (p = 0.21, not significant). The ensemble was not reliably better than TCFormer alone (+2.2 points on ME, p = 0.27; −1.1 on MI). Per-subject ME and MI accuracies are moderately correlated in this task (r = 0.55, n = 10). Subjects S006 and S009 were at or below chance on MI in both tasks, but S009 reached 94.4% and 88.9% on ME. That points to a weakness specific to imagery, not to a generally poor responder.</w:t>
       </w:r>
     </w:p>
     <w:p>
@@ -12335,7 +12335,7 @@
           <w:sz w:val="20"/>
           <w:szCs w:val="20"/>
         </w:rPr>
-        <w:t xml:space="preserve"> To measure what cross-subject pretraining adds, we retrained TCFormer without it (notebook v6) on the same ten subjects, with the same code, the same three seeds and the same 18 held-out trials per subject and mode (the split is deterministic). We then compared the seed-averaged results subject by subject with the pretrained runs of Tables VI and VII (Table VIII). The two arms ran in separate sessions, so GPU nondeterminism cannot be ruled out. On Task B executed movement, pretraining raised accuracy from 78.9% to 86.7% (+7.8 points). It helped 9 of 10 subjects, tied for 1 and hurt none (paired t-test p = 0.003, Wilcoxon p = 0.004), and the result survives a Bonferroni correction for the four comparisons (threshold 0.0125). On Task A the group mean rose by 8.3 points in both modes, but individual differences ranged from −16.7 to +44.4 points and neither gain is significant with ten subjects (p = 0.12 and 0.11). On Task B imagined movement there was no gain (0.0 points, p = 1.0). The three-seed baseline sits 0.5 and 1.7 points above the single-run baselines of Table III on Task A, but 8.9 and 11.7 points above them on Task B. About half of the +16.7 points on executed movement and all of the +11.7 points on imagined movement seen against Table III were therefore run-to-run variation.</w:t>
+        <w:t xml:space="preserve"> To see what cross-subject pretraining adds, we retrained TCFormer without it (notebook v6) on the same ten subjects, with the same code, the same three seeds and the same 18 held-out trials per subject and mode (the split is deterministic). We then compared the seed-averaged results subject by subject with the pretrained runs of Tables VI and VII (Table VIII). The two arms ran in separate sessions, so GPU nondeterminism cannot be ruled out. On Task B executed movement, pretraining raised accuracy from 78.9% to 86.7% (+7.8 points). It helped 9 of 10 subjects, tied for 1 and hurt none (paired t-test p = 0.003, Wilcoxon p = 0.004), and the result survives a Bonferroni correction for the four comparisons (threshold 0.0125). On Task A the group mean rose by 8.3 points in both modes, but individual differences ranged from −16.7 to +44.4 points, and neither gain is significant with ten subjects (p = 0.12 and 0.11). On Task B imagined movement there was no gain (0.0 points, p = 1.0). The three-seed baseline sits 0.5 and 1.7 points above the single-run baselines of Table III on Task A, but 8.9 and 11.7 points above them on Task B. So about half of the +16.7 points on executed movement, and all of the +11.7 points on imagined movement, seen against Table III were run-to-run variation.</w:t>
       </w:r>
     </w:p>
     <w:p>
@@ -12350,7 +12350,7 @@
           <w:sz w:val="20"/>
           <w:szCs w:val="20"/>
         </w:rPr>
-        <w:t xml:space="preserve">Seed averaging raised the baseline by 4.1–5.2 points but the pretrained models by at most 0.9 points (mean single-seed accuracy for Task A ME, A MI, B ME and B MI: baseline 61.9%, 56.5%, 74.4% and 67.0%; pretrained 75.2%, 69.1%, 86.5% and 70.9%). A single pretrained seed is therefore about as good as the three-seed average, while single baseline runs are lower and less stable. Against single seeds, pretraining gains 12.0–13.3 points on the first three conditions (paired p = 0.009–0.033) and 3.9 points on Task B imagined movement (p = 0.26).</w:t>
+        <w:t xml:space="preserve">Seed averaging raised the baseline by 4.1–5.2 points, but the pretrained models by at most 0.9 points (mean single-seed accuracy for Task A ME, A MI, B ME and B MI: baseline 61.9%, 56.5%, 74.4% and 67.0%; pretrained 75.2%, 69.1%, 86.5% and 70.9%). One pretrained seed is therefore about as good as the three-seed average, while single baseline runs are lower and less stable. Compared with single seeds, pretraining gains 12.0–13.3 points on the first three conditions (paired p = 0.009–0.033) and 3.9 points on Task B imagined movement (p = 0.26).</w:t>
       </w:r>
     </w:p>
     <w:p>
@@ -13451,7 +13451,7 @@
           <w:sz w:val="20"/>
           <w:szCs w:val="20"/>
         </w:rPr>
-        <w:t xml:space="preserve"> The models used by the software demo are the flagship models of S007 for Task A and S002 for Task B, trained with seed 0 and without cross-subject pretraining. On their 18 held-out trials, executed and imagined movement reach 83.3% (15 of 18) and 100% (18 of 18) for S007, with per-window accuracy of 72.4% and 77.8%, and 100% (18 of 18) and 88.9% (16 of 18) for S002, with per-window accuracy of 84.9% and 63.1%. The three Task A executed-movement errors were two rest trials and one left-fist trial, all labelled right fist; the two Task B imagined-movement errors were one both-feet trial labelled rest and one rest trial labelled both-fists. These are best-case, single-subject results chosen on the evaluation data, so they are optimistic, and they are not directly commensurable with the base paper’s group-level finger-decoding accuracies (two-finger 81.10% executed and 80.56% imagined; three-finger 60.11% and 60.61%) [1], since task granularity, subject selection, and evaluation protocol all differ.</w:t>
+        <w:t xml:space="preserve"> The software demo uses the flagship models of S007 for Task A and S002 for Task B, trained with seed 0 and without cross-subject pretraining. On their 18 held-out trials, S007 reaches 83.3% (15 of 18) on executed and 100% (18 of 18) on imagined movement, with per-window accuracy of 72.4% and 77.8%. S002 reaches 100% (18 of 18) on executed and 88.9% (16 of 18) on imagined movement, with per-window accuracy of 84.9% and 63.1%. The three Task A executed-movement errors were two rest trials and one left-fist trial, all labelled right fist. The two Task B imagined-movement errors were one both-feet trial labelled rest and one rest trial labelled both-fists. These are best-case results for single subjects, chosen on the evaluation data, so they are optimistic. They are also not directly comparable with the base paper’s group-level finger-decoding accuracies (two-finger 81.10% executed and 80.56% imagined; three-finger 60.11% and 60.61%) [1], because the task granularity, subject selection and evaluation protocol all differ.</w:t>
       </w:r>
     </w:p>
     <w:p>
@@ -13476,7 +13476,7 @@
           <w:sz w:val="20"/>
           <w:szCs w:val="20"/>
         </w:rPr>
-        <w:t xml:space="preserve"> The finger notebook was run on subject S01 of the base paper’s dataset [7] for two fingers (thumb versus pinky) and three fingers (thumb, index, pinky), with TCFormer and EEGNet and three seeds averaged. The split is chronological, by whole trial and by session: the model is pretrained on the subject’s own earlier sessions of both modes (no other subjects), fine-tuned on the first 30% of the trials of the last session, and evaluated on the remaining, later trials of that session (448 trials for two fingers, 336 for three; Table IX). For two fingers TCFormer reached 79.9% on executed movement (Wilson 95% interval [29], 76.0–83.4%) and 71.4% on imagined movement (67.1–75.4%), against 76.1% and 65.4% for EEGNet. The three TCFormer seeds agreed within 1.8 points on ME and 3.8 on MI, while the EEGNet seeds spread over 6.5 and 5.6 points. For three fingers TCFormer reached 44.6% (ME) and 43.2% (MI) and EEGNet 46.7% and 37.2%. All of these are above the 33.3% chance level except EEGNet on imagined movement (p = 0.075, exact binomial test). The equal-weight ensemble stayed within 2.1 points of the better single model and was ahead of it only for three-finger ME (+0.9).</w:t>
+        <w:t xml:space="preserve"> We ran the finger notebook on subject S01 of the base paper’s dataset [7] for two fingers (thumb versus pinky) and three fingers (thumb, index, pinky), with TCFormer and EEGNet and three seeds averaged. The split is chronological, by whole trial and by session. The model is pretrained on the subject’s own earlier sessions of both modes (no other subjects), fine-tuned on the first 30% of the trials of the last session, and evaluated on the remaining, later trials of that session (448 trials for two fingers, 336 for three; Table IX). For two fingers TCFormer reached 79.9% on executed movement (Wilson 95% interval [29], 76.0–83.4%) and 71.4% on imagined movement (67.1–75.4%), against 76.1% and 65.4% for EEGNet. The three TCFormer seeds agreed within 1.8 points on ME and 3.8 on MI, while the EEGNet seeds spread over 6.5 and 5.6 points. For three fingers TCFormer reached 44.6% (ME) and 43.2% (MI), and EEGNet 46.7% and 37.2%. All of these are above the 33.3% chance level except EEGNet on imagined movement (p = 0.075, exact binomial test). The equal-weight ensemble stayed within 2.1 points of the better single model and was ahead of it only for three-finger ME (+0.9).</w:t>
       </w:r>
     </w:p>
     <w:p>
@@ -14567,7 +14567,7 @@
           <w:sz w:val="20"/>
           <w:szCs w:val="20"/>
         </w:rPr>
-        <w:t xml:space="preserve">These results come from one subject, so they say nothing about differences between people. The intervals treat trials as independent although they come from one subject and a few sessions, so they are optimistic, and the architecture differences cannot be tested without per-trial predictions. Our two-finger executed-movement accuracy is close to the base paper’s 81.10% [1], and our imagined-movement accuracy is about 9 points below its 80.56%. Our three-finger accuracies are 15 to 17 points below its 60.11% and 60.61%. The base paper reports means over 21 subjects with online fine-tuning, so the comparison is only indicative.</w:t>
+        <w:t xml:space="preserve">These results come from one subject, so they say nothing about differences between people. The intervals treat trials as independent even though they come from one subject and a few sessions, so they are optimistic. We also cannot test the architecture differences without per-trial predictions. Our two-finger executed-movement accuracy is close to the base paper’s 81.10% [1], and our imagined-movement accuracy is about 9 points below its 80.56%. Our three-finger accuracies are 15 to 17 points below its 60.11% and 60.61%. The base paper reports means over 21 subjects with online fine-tuning, so this comparison is only a rough guide.</w:t>
       </w:r>
     </w:p>
     <w:p>
@@ -14652,7 +14652,7 @@
           <w:sz w:val="20"/>
           <w:szCs w:val="20"/>
         </w:rPr>
-        <w:t xml:space="preserve"> is a FastAPI server. Its endpoints are /api/health, /api/models, /api/tasks, /api/predict, /api/replay/log/{task}, /ws/replay/{task}, /api/upload/edf and /api/upload/csv. It runs the preprocessing of Section 5.1 and one ONNX Runtime model per task and mode, and turns window predictions into a trial label by majority vote. The band-pass filter is stored as fixed taps identical to the MNE filter used in training (maximum difference 4×10⁻¹⁴ on test data), so the server sees the same input the models saw during training. </w:t>
+        <w:t xml:space="preserve"> is a FastAPI server. Its endpoints are /api/health, /api/models, /api/tasks, /api/predict, /api/replay/log/{task}, /ws/replay/{task}, /api/upload/edf and /api/upload/csv. It runs the preprocessing of Section 5.1 and one ONNX Runtime model per task and mode, and turns window predictions into a trial label by majority vote. The band-pass filter is stored as fixed taps that match the MNE filter used in training (maximum difference 4×10⁻¹⁴ on test data), so the server sees the same input the models saw during training. </w:t>
       </w:r>
       <w:r>
         <w:rPr>
@@ -14685,7 +14685,7 @@
           <w:sz w:val="20"/>
           <w:szCs w:val="20"/>
         </w:rPr>
-        <w:t xml:space="preserve">Following a deliberate scope decision, the system is entirely software-based and runs as a web service on Render or locally on a laptop: no physical robotic hardware is targeted, and no call to any external LLM or third-party inference API exists anywhere in the pipeline. The server never invents output. When no model is loaded for a task and mode it answers with an error, ground truth is shown only when the data really contain it (the T0/T1/T2 annotations of an EDF file), and files that lack the 64 PhysioNet channels are rejected. The server is covered by 58 automated tests: 45 use small synthetic ONNX models and the stored replay logs, 10 run the four exported TCFormer models themselves (they load, give valid probabilities, and agree with the manifest and the replay logs), and 3 check the web page. A public instance is hosted at https://neurobot-nrnn.onrender.com/ on the free plan, so the first request after an idle period is slow.</w:t>
+        <w:t xml:space="preserve">The system is software-only by design. It runs as a web service on Render or locally on a laptop. No physical robotic hardware is targeted, and the pipeline calls no external LLM or third-party inference API. The server never invents output. If no model is loaded for a task and mode, it returns an error. Ground truth is shown only when the data contain it (the T0/T1/T2 annotations of an EDF file), and files without the 64 PhysioNet channels are rejected. The server has 62 automated tests: 45 use small synthetic ONNX models and the stored replay logs, 10 run the four exported TCFormer models themselves, 3 check the web page, and 4 cover the finger replays. A public instance is hosted at https://neurobot-nrnn.onrender.com/ on the free plan, so the first request after an idle period is slow.</w:t>
       </w:r>
     </w:p>
     <w:p>
@@ -14717,7 +14717,7 @@
           <w:sz w:val="20"/>
           <w:szCs w:val="20"/>
         </w:rPr>
-        <w:t xml:space="preserve">Fig. 4 shows the Decode Console. For each window of a replayed or uploaded session it shows the decoded command with its confidence, the ground-truth label when there is one, and a match flag. It also drives a three-dimensional virtual bionic-limb model in the browser that moves the arms, the legs or both according to the decoded class. The limbs are a software visualization only, and no physical hardware is involved. Below the model the console shows a six-channel EEG window with playback controls, the softmax class probabilities and the task selector. Fig. 5 shows the other views: the Task B replay with the legs extended (a), a finger-kinematics test with manual sliders (b), the session analytics with a confusion matrix (c), and the Custom Data Lab for uploading EDF or CSV recordings or generating a synthetic session (d). The finger test is a manual demonstration. A separate finger view shows a close-up of the right hand and flexes the decoded finger (thumb, index or pinky); until a finger model is exported it plays a simulated sequence that is labelled as such and is not a result. The hand model has five articulated digits, but the finger-level dataset covers thumb, index, middle and pinky, and the deployed models decode whole-limb commands, so a decoded limb command curls the whole hand and not single fingers. Rows and colors are built from the label order of the loaded task, so the same interface serves both tasks.</w:t>
+        <w:t xml:space="preserve">Fig. 4 shows the Decode Console. For each window of a replayed or uploaded session it shows the decoded command with its confidence, the ground-truth label when there is one, and a match flag. It also drives a three-dimensional virtual bionic-limb model in the browser that moves the arms, the legs or both, depending on the decoded class. The limbs are a software visualization only, and no physical hardware is involved. Below the model the console shows a six-channel EEG window with playback controls, the softmax class probabilities and the task selector. Fig. 5 shows the other views: the Task B replay with the legs extended (a), a finger-kinematics test with manual sliders (b), the session analytics with a confusion matrix (c), and the Custom Data Lab for uploading EDF or CSV recordings or generating a synthetic session (d). The finger test is a manual demonstration. A separate finger view shows a close-up of the right hand and flexes the decoded finger (thumb, index or pinky). It replays held-out trials of finger models for subject S01, each trained for 25 epochs with one seed (majority-vote accuracy 77.5% and 69.4% for two fingers, executed and imagined, and 54.2% and 43.5% for three). These are not the three-seed results of Table IX. Without a replay it plays a labelled simulated sequence. The hand model has five articulated digits, but the finger-level dataset covers thumb, index, middle and pinky, and the deployed models decode whole-limb commands. A decoded limb command therefore curls the whole hand, not single fingers. The Signal tab marks band power, amplitude and signal quality as not measured. Rows and colors are built from the label order of the loaded task, so the same interface serves both tasks.</w:t>
       </w:r>
     </w:p>
     <w:p>
@@ -14749,7 +14749,7 @@
           <w:sz w:val="20"/>
           <w:szCs w:val="20"/>
         </w:rPr>
-        <w:t xml:space="preserve">Table X lists the checks made on the system. T1–T7, T9 and T10 belong to the automated suite (58 tests, all passing) and T8 was checked by hand in the front end. Most of the suite uses small synthetic ONNX models, so it tests the server logic. T9 and T10 check that the real exported files load and agree with their manifest and replay logs; they do not measure accuracy on new data.</w:t>
+        <w:t xml:space="preserve">Table X lists the checks made on the system. T1–T7, T9 and T10 are part of the automated suite (62 tests, all passing), and T8 was checked by hand in the front end. Most of the suite uses small synthetic ONNX models, so it tests the server logic. T9 and T10 check that the real exported files load and agree with their manifest and replay logs, not their accuracy on new data.</w:t>
       </w:r>
     </w:p>
     <w:p>
@@ -16003,7 +16003,7 @@
                 <w:sz w:val="16"/>
                 <w:szCs w:val="16"/>
               </w:rPr>
-              <w:t xml:space="preserve">All four TCFormer ONNX models load; outputs are valid probabilities; ONNX matches PyTorch within 1e-5</w:t>
+              <w:t xml:space="preserve">Four ONNX models load and match PyTorch (1e-5)</w:t>
             </w:r>
           </w:p>
         </w:tc>
@@ -16141,7 +16141,7 @@
                 <w:sz w:val="16"/>
                 <w:szCs w:val="16"/>
               </w:rPr>
-              <w:t xml:space="preserve">Label order and accuracy recomputed from each replay log match the manifest</w:t>
+              <w:t xml:space="preserve">Replay logs match the manifest</w:t>
             </w:r>
           </w:p>
         </w:tc>
@@ -16384,7 +16384,7 @@
           <w:sz w:val="20"/>
           <w:szCs w:val="20"/>
         </w:rPr>
-        <w:t xml:space="preserve">The trial-level results of Table III are single, unseeded runs: two runs of the same code differ by up to about 7 points in group mean (Section 7). The cross-subject comparison (Tables VI–VIII) averages three seeds in both arms, but each arm is one session per task, and the two arms ran in separate sessions.</w:t>
+        <w:t xml:space="preserve">The trial-level results of Table III are single, unseeded runs. Two runs of the same code differ by up to about 7 points in group mean (Section 7). The cross-subject comparison (Tables VI–VIII) averages three seeds in both arms, but each arm is one session per task, and the two arms ran in separate sessions.</w:t>
       </w:r>
     </w:p>
     <w:p>
@@ -16403,7 +16403,7 @@
           <w:sz w:val="20"/>
           <w:szCs w:val="20"/>
         </w:rPr>
-        <w:t xml:space="preserve">Subject-to-subject variability is large and persistent across every architecture and protocol tried; a small set of subjects (e.g., S002, S004, S007) outperformed the others in earlier runs, suggesting a physiological rather than methodological ceiling for weak responders. In the cross-subject runs, however, executed- and imagined-movement accuracies were uncorrelated across subjects in Task A (r = 0.02) and moderately correlated in Task B (r = 0.55; n = 10 each); only S006 and S009 were at or below chance on imagined movement in both tasks, while S009 reached 88.9–94.4% on executed movement, so the weakness may be specific to imagery.</w:t>
+        <w:t xml:space="preserve">Differences between subjects are large and persist across every architecture and protocol we tried. A few subjects (e.g., S002, S004, S007) did better than the rest in earlier runs, which suggests a physiological ceiling for weak responders rather than a methodological one. In the cross-subject runs, however, executed- and imagined-movement accuracies were uncorrelated across subjects in Task A (r = 0.02) and moderately correlated in Task B (r = 0.55; n = 10 each). Only S006 and S009 were at or below chance on imagined movement in both tasks, and S009 reached 88.9–94.4% on executed movement, so the weakness may be specific to imagery.</w:t>
       </w:r>
     </w:p>
     <w:p>
@@ -16441,7 +16441,7 @@
           <w:sz w:val="20"/>
           <w:szCs w:val="20"/>
         </w:rPr>
-        <w:t xml:space="preserve">Group-mean accuracy exceeds the project’s 85% target only for Task B executed movement (TCFormer 86.7%, 95% interval ±9.4 points, which includes values below 85%; the baseline without pretraining reached 78.9%). The other three conditions reach 70–74% with cross-subject pretraining, and imagined movement remains far from the target.</w:t>
+        <w:t xml:space="preserve">Group-mean accuracy passes our 85% target only for Task B executed movement (TCFormer 86.7%, 95% interval ±9.4 points, which includes values below 85%; the baseline without pretraining reached 78.9%). The other three conditions reach 70–74% with cross-subject pretraining, and imagined movement is still far from the target.</w:t>
       </w:r>
     </w:p>
     <w:p>
@@ -16460,7 +16460,7 @@
           <w:sz w:val="20"/>
           <w:szCs w:val="20"/>
         </w:rPr>
-        <w:t xml:space="preserve">The window-length ablation (v9) covered four subjects of Task A only and was inconclusive. Cross-subject pretraining is significant in only one of four conditions (Task B executed movement, +7.8 points, p = 0.003); on Task A its +8.3 points in both modes cannot be separated from zero with ten subjects of about 18 trials each (p = 0.12 and 0.11), and Task B imagined movement shows no gain (Section 7).</w:t>
+        <w:t xml:space="preserve">The window-length ablation (v9) covered only four subjects of Task A and was inconclusive. Cross-subject pretraining is significant in only one of four conditions (Task B executed movement, +7.8 points, p = 0.003). On Task A its +8.3 points in both modes cannot be told apart from zero with ten subjects of about 18 trials each (p = 0.12 and 0.11), and Task B imagined movement shows no gain (Section 7).</w:t>
       </w:r>
     </w:p>
     <w:p>
@@ -16479,7 +16479,7 @@
           <w:sz w:val="20"/>
           <w:szCs w:val="20"/>
         </w:rPr>
-        <w:t xml:space="preserve">The finger-level results come from a single subject (S01), so they give no estimate of between-subject variability, and their intervals (±3.7 points for two-finger executed movement) treat trials from one subject as independent. They were obtained offline, without the real-time, in-session closed-loop neurofeedback that the base paper documents as improving subject performance during acquisition, which may contribute to the three-finger accuracy (44.6% executed) lying below the base paper’s 60.11%.</w:t>
+        <w:t xml:space="preserve">The finger-level results come from a single subject (S01), so they say nothing about differences between people, and their intervals (±3.7 points for two-finger executed movement) treat trials from one subject as independent. They were obtained offline, without the real-time, closed-loop neurofeedback that the base paper reports as improving subject performance during acquisition. That may be part of why our three-finger accuracy (44.6% executed) is below the base paper’s 60.11%.</w:t>
       </w:r>
     </w:p>
     <w:p>
@@ -16503,23 +16503,6 @@
     </w:p>
     <w:p>
       <w:pPr>
-        <w:pStyle w:val="Heading1"/>
-        <w:keepNext/>
-        <w:spacing w:after="80" w:before="200"/>
-        <w:jc w:val="center"/>
-      </w:pPr>
-      <w:r>
-        <w:rPr>
-          <w:rFonts w:ascii="Times New Roman" w:cs="Times New Roman" w:eastAsia="Times New Roman" w:hAnsi="Times New Roman"/>
-          <w:smallCaps/>
-          <w:sz w:val="20"/>
-          <w:szCs w:val="20"/>
-        </w:rPr>
-        <w:t xml:space="preserve">10. Future Work</w:t>
-      </w:r>
-    </w:p>
-    <w:p>
-      <w:pPr>
         <w:pStyle w:val="ListParagraph"/>
         <w:numPr>
           <w:ilvl w:val="0"/>
@@ -16534,7 +16517,24 @@
           <w:sz w:val="20"/>
           <w:szCs w:val="20"/>
         </w:rPr>
-        <w:t xml:space="preserve">Extend the finger-level track beyond subject S01 (more subjects, with cross-subject pretraining); a four-finger evaluation would need a different protocol, for example a held-out part of the offline session.</w:t>
+        <w:t xml:space="preserve">The web demo serves the baseline flagship models, not the pretrained versions, and its finger models are single-seed, 25-epoch runs on subject S01 only. The Signal tab shows only stored traces. Band power, amplitude and signal quality are not measured.</w:t>
+      </w:r>
+    </w:p>
+    <w:p>
+      <w:pPr>
+        <w:pStyle w:val="Heading1"/>
+        <w:keepNext/>
+        <w:spacing w:after="80" w:before="200"/>
+        <w:jc w:val="center"/>
+      </w:pPr>
+      <w:r>
+        <w:rPr>
+          <w:rFonts w:ascii="Times New Roman" w:cs="Times New Roman" w:eastAsia="Times New Roman" w:hAnsi="Times New Roman"/>
+          <w:smallCaps/>
+          <w:sz w:val="20"/>
+          <w:szCs w:val="20"/>
+        </w:rPr>
+        <w:t xml:space="preserve">10. Future Work</w:t>
       </w:r>
     </w:p>
     <w:p>
@@ -16553,7 +16553,7 @@
           <w:sz w:val="20"/>
           <w:szCs w:val="20"/>
         </w:rPr>
-        <w:t xml:space="preserve">Repeat the window-length ablation on more subjects (the four-subject pilot was inconclusive).</w:t>
+        <w:t xml:space="preserve">Extend the finger-level track beyond subject S01 (more subjects, with cross-subject pretraining); a four-finger evaluation would need a different protocol, for example a held-out part of the offline session.</w:t>
       </w:r>
     </w:p>
     <w:p>
@@ -16572,7 +16572,7 @@
           <w:sz w:val="20"/>
           <w:szCs w:val="20"/>
         </w:rPr>
-        <w:t xml:space="preserve">Evaluate more subjects and held-out trials per condition so that the Task A pretraining gain (+8.3 points in both modes, Section 7) can be confirmed or excluded, and test whether per-run channel standardization or a sensorimotor channel subset helps the weakest subjects.</w:t>
+        <w:t xml:space="preserve">Repeat the window-length ablation on more subjects (the four-subject pilot was inconclusive).</w:t>
       </w:r>
     </w:p>
     <w:p>
@@ -16591,7 +16591,7 @@
           <w:sz w:val="20"/>
           <w:szCs w:val="20"/>
         </w:rPr>
-        <w:t xml:space="preserve">Full redesign of the Decode Console user interface.</w:t>
+        <w:t xml:space="preserve">Evaluate more subjects and held-out trials per condition so that the Task A pretraining gain (+8.3 points in both modes, Section 7) can be confirmed or excluded, and test whether per-run channel standardization or a sensorimotor channel subset helps the weakest subjects.</w:t>
       </w:r>
     </w:p>
     <w:p>
@@ -16610,7 +16610,7 @@
           <w:sz w:val="20"/>
           <w:szCs w:val="20"/>
         </w:rPr>
-        <w:t xml:space="preserve">Support multiple, flexible EEG input methods and data sources.</w:t>
+        <w:t xml:space="preserve">Full redesign of the Decode Console user interface.</w:t>
       </w:r>
     </w:p>
     <w:p>
@@ -16629,6 +16629,25 @@
           <w:sz w:val="20"/>
           <w:szCs w:val="20"/>
         </w:rPr>
+        <w:t xml:space="preserve">Support multiple, flexible EEG input methods and data sources.</w:t>
+      </w:r>
+    </w:p>
+    <w:p>
+      <w:pPr>
+        <w:pStyle w:val="ListParagraph"/>
+        <w:numPr>
+          <w:ilvl w:val="0"/>
+          <w:numId w:val="2"/>
+        </w:numPr>
+        <w:spacing w:after="40" w:line="240"/>
+        <w:jc w:val="both"/>
+      </w:pPr>
+      <w:r>
+        <w:rPr>
+          <w:rFonts w:ascii="Times New Roman" w:cs="Times New Roman" w:eastAsia="Times New Roman" w:hAnsi="Times New Roman"/>
+          <w:sz w:val="20"/>
+          <w:szCs w:val="20"/>
+        </w:rPr>
         <w:t xml:space="preserve">Revisit guardrail and observability mechanisms (confidence thresholds, structured output validation, decode logging) appropriate to a software-only deployment.</w:t>
       </w:r>
     </w:p>
@@ -16661,7 +16680,7 @@
           <w:sz w:val="20"/>
           <w:szCs w:val="20"/>
         </w:rPr>
-        <w:t xml:space="preserve">NeuroBot shows that an EEG decoding pipeline can be built and trained entirely by ourselves, without an external API, and that it decodes coarse limb-level motor intention well above chance. With cross-subject pretraining the group-mean trial-level accuracy is 70–87% (chance 33%), and individual subjects reach 100%. Without pretraining, under the same protocol, it is 62–79%; the gain is significant only for Task B executed movement. A single-subject finger-level pilot reaches 79.9% for two fingers and 44.6% for three fingers on executed movement. The development history is as much a result as the final numbers: each iteration in Section 6 responded to a specific problem in the one before, and each architectural change, most notably the TCFormer pooling correction, was tested before we adopted it. The trained models are served by a software-only three-tier application. Future work will bring the same care to the finger-level task and to a more complete software product.</w:t>
+        <w:t xml:space="preserve">NeuroBot shows that we can build and train an EEG decoding pipeline ourselves, without an external API, and that it decodes coarse limb-level motor intention well above chance. With cross-subject pretraining the group-mean trial-level accuracy is 70–87% (chance 33%), and individual subjects reach 100%. Without pretraining, under the same protocol, it is 62–79%, and the gain is significant only for Task B executed movement. A single-subject finger-level pilot reaches 79.9% for two fingers and 44.6% for three fingers on executed movement. The development history matters as much as the final numbers. Each iteration in Section 6 answered a specific problem in the one before, and each architectural change, most of all the TCFormer pooling correction, was tested before we adopted it. The trained models are served by a software-only three-tier application. Next we want to bring the same care to the finger-level task and to a more complete software product.</w:t>
       </w:r>
     </w:p>
     <w:p>

</xml_diff>